<commit_message>
Add blog comments and visitor auth
</commit_message>
<xml_diff>
--- a/docs/comprehensive/word/portfolio-platform-comprehensive-documentation.docx
+++ b/docs/comprehensive/word/portfolio-platform-comprehensive-documentation.docx
@@ -12,7 +12,7 @@
     </w:p>
     <w:p>
       <w:r>
-        <w:t>Generated from Markdown sources on 2026-03-05 04:18 UTC.</w:t>
+        <w:t>Generated from Markdown sources on 2026-03-08 00:50 UTC.</w:t>
       </w:r>
     </w:p>
     <w:p/>
@@ -41,7 +41,7 @@
     <w:p/>
     <w:p>
       <w:r>
-        <w:t>Last updated: 2026-03-04</w:t>
+        <w:t>Last updated: 2026-03-07</w:t>
       </w:r>
     </w:p>
     <w:p/>
@@ -232,6 +232,14 @@
       </w:pPr>
       <w:r>
         <w:t>Includes extension guidance for future categories/content types and service expansion.</w:t>
+      </w:r>
+    </w:p>
+    <w:p>
+      <w:pPr>
+        <w:pStyle w:val="ListBullet"/>
+      </w:pPr>
+      <w:r>
+        <w:t>Includes the no-cache route-loading rollout, structured Content Studio workspace, unpublish flow, and current analytics/media architecture.</w:t>
       </w:r>
     </w:p>
     <w:p/>
@@ -1928,7 +1936,15 @@
         <w:pStyle w:val="ListBullet"/>
       </w:pPr>
       <w:r>
-        <w:t>bounded request body parsing (`2mb` limits).</w:t>
+        <w:t>bounded request body parsing via `REQUEST_BODY_LIMIT` (default `6mb`).</w:t>
+      </w:r>
+    </w:p>
+    <w:p>
+      <w:pPr>
+        <w:pStyle w:val="ListBullet"/>
+      </w:pPr>
+      <w:r>
+        <w:t>dynamic GET responses marked `Cache-Control: no-store`.</w:t>
       </w:r>
     </w:p>
     <w:p/>
@@ -2052,6 +2068,33 @@
           <w:sz w:val="18"/>
         </w:rPr>
         <w:t>| API region | `us-east-2` | workflows + code defaults |</w:t>
+      </w:r>
+    </w:p>
+    <w:p>
+      <w:r>
+        <w:rPr>
+          <w:rFonts w:ascii="Consolas" w:hAnsi="Consolas"/>
+          <w:sz w:val="18"/>
+        </w:rPr>
+        <w:t>| Lambda alias | `live` | runtime configuration |</w:t>
+      </w:r>
+    </w:p>
+    <w:p>
+      <w:r>
+        <w:rPr>
+          <w:rFonts w:ascii="Consolas" w:hAnsi="Consolas"/>
+          <w:sz w:val="18"/>
+        </w:rPr>
+        <w:t>| Lambda architecture | `arm64` | runtime configuration |</w:t>
+      </w:r>
+    </w:p>
+    <w:p>
+      <w:r>
+        <w:rPr>
+          <w:rFonts w:ascii="Consolas" w:hAnsi="Consolas"/>
+          <w:sz w:val="18"/>
+        </w:rPr>
+        <w:t>| Lambda provisioned concurrency | `2` | runtime configuration |</w:t>
       </w:r>
     </w:p>
     <w:p>
@@ -3160,7 +3203,7 @@
         <w:pStyle w:val="ListBullet"/>
       </w:pPr>
       <w:r>
-        <w:t>request path cache invalidates on write methods.</w:t>
+        <w:t>dynamic API GET responses are marked `no-store`; the backend no longer keeps an in-process GET cache.</w:t>
       </w:r>
     </w:p>
     <w:p>
@@ -3192,6 +3235,14 @@
         <w:pStyle w:val="ListBullet"/>
       </w:pPr>
       <w:r>
+        <w:t>scheduler publish flow suppresses stale executions via active `scheduleName` checks and cleanup paths.</w:t>
+      </w:r>
+    </w:p>
+    <w:p>
+      <w:pPr>
+        <w:pStyle w:val="ListBullet"/>
+      </w:pPr>
+      <w:r>
         <w:t>health probes expose backend readiness state for DynamoDB and Redis compatibility mode (if enabled).</w:t>
       </w:r>
     </w:p>
@@ -3208,6 +3259,14 @@
         <w:pStyle w:val="ListBullet"/>
       </w:pPr>
       <w:r>
+        <w:t>`v3` route-shaped endpoints reduce merge/sort work on the frontend and avoid full-table scans in normal authoring paths.</w:t>
+      </w:r>
+    </w:p>
+    <w:p>
+      <w:pPr>
+        <w:pStyle w:val="ListBullet"/>
+      </w:pPr>
+      <w:r>
         <w:t>metadata-first + media-batch split lowers payload size on initial list route reads.</w:t>
       </w:r>
     </w:p>
@@ -3365,7 +3424,15 @@
         <w:pStyle w:val="ListBullet"/>
       </w:pPr>
       <w:r>
-        <w:t>Apply route-scoped browser caching and snapshot fallback for read performance.</w:t>
+        <w:t>Reuse only route-scoped in-memory reads during the current SPA session.</w:t>
+      </w:r>
+    </w:p>
+    <w:p>
+      <w:pPr>
+        <w:pStyle w:val="ListBullet"/>
+      </w:pPr>
+      <w:r>
+        <w:t>Render metadata before non-critical media and append list/timeline content progressively.</w:t>
       </w:r>
     </w:p>
     <w:p/>
@@ -3507,7 +3574,15 @@
         <w:pStyle w:val="ListBullet"/>
       </w:pPr>
       <w:r>
-        <w:t>Blog/media lists use metadata-first `v2` reads + batch media hydration.</w:t>
+        <w:t>Blog feed/media lists use metadata-first `v2` reads + batch media hydration.</w:t>
+      </w:r>
+    </w:p>
+    <w:p>
+      <w:pPr>
+        <w:pStyle w:val="ListBullet"/>
+      </w:pPr>
+      <w:r>
+        <w:t>Landing, work, projects, and blog detail prefer `v3` route-shaped payloads.</w:t>
       </w:r>
     </w:p>
     <w:p/>
@@ -3549,6 +3624,14 @@
         <w:pStyle w:val="ListBullet"/>
       </w:pPr>
       <w:r>
+        <w:t>Blog unpublish and send-now notification controls.</w:t>
+      </w:r>
+    </w:p>
+    <w:p>
+      <w:pPr>
+        <w:pStyle w:val="ListBullet"/>
+      </w:pPr>
+      <w:r>
         <w:t>Site content editing and image upload.</w:t>
       </w:r>
     </w:p>
@@ -3568,6 +3651,14 @@
         <w:t>Collections management (authoring-only content categories and visibility).</w:t>
       </w:r>
     </w:p>
+    <w:p>
+      <w:pPr>
+        <w:pStyle w:val="ListBullet"/>
+      </w:pPr>
+      <w:r>
+        <w:t>Human-friendly section-based editing over the same backend record model.</w:t>
+      </w:r>
+    </w:p>
     <w:p/>
     <w:p>
       <w:pPr>
@@ -3881,6 +3972,14 @@
         <w:pStyle w:val="ListBullet"/>
       </w:pPr>
       <w:r>
+        <w:t>save path keeps `BlogBody` and `BlogText` aligned for existing and new posts.</w:t>
+      </w:r>
+    </w:p>
+    <w:p>
+      <w:pPr>
+        <w:pStyle w:val="ListBullet"/>
+      </w:pPr>
+      <w:r>
         <w:t>notification subscriber admin APIs.</w:t>
       </w:r>
     </w:p>
@@ -3889,6 +3988,14 @@
         <w:pStyle w:val="ListBullet"/>
       </w:pPr>
       <w:r>
+        <w:t>unpublish API integration.</w:t>
+      </w:r>
+    </w:p>
+    <w:p>
+      <w:pPr>
+        <w:pStyle w:val="ListBullet"/>
+      </w:pPr>
+      <w:r>
         <w:t>preview token session APIs.</w:t>
       </w:r>
     </w:p>
@@ -3913,7 +4020,15 @@
         <w:pStyle w:val="ListBullet"/>
       </w:pPr>
       <w:r>
-        <w:t>route-scoped read caching and `v2` fallback behavior.</w:t>
+        <w:t>route-scoped in-memory read reuse and `v2`/`v3` fallback behavior.</w:t>
+      </w:r>
+    </w:p>
+    <w:p>
+      <w:pPr>
+        <w:pStyle w:val="ListBullet"/>
+      </w:pPr>
+      <w:r>
+        <w:t>inline editor image normalization for embedded `data:image/*` markup.</w:t>
       </w:r>
     </w:p>
     <w:p/>
@@ -3958,7 +4073,7 @@
         <w:pStyle w:val="ListBullet"/>
       </w:pPr>
       <w:r>
-        <w:t>in-memory GET cache with write invalidation.</w:t>
+        <w:t>dynamic GET responses marked `Cache-Control: no-store`.</w:t>
       </w:r>
     </w:p>
     <w:p>
@@ -3966,6 +4081,14 @@
         <w:pStyle w:val="ListBullet"/>
       </w:pPr>
       <w:r>
+        <w:t>configurable request body limit (`REQUEST_BODY_LIMIT`, default `6mb`).</w:t>
+      </w:r>
+    </w:p>
+    <w:p>
+      <w:pPr>
+        <w:pStyle w:val="ListBullet"/>
+      </w:pPr>
+      <w:r>
         <w:t>route mounting for all API groups.</w:t>
       </w:r>
     </w:p>
@@ -4069,6 +4192,70 @@
         <w:pStyle w:val="ListBullet"/>
       </w:pPr>
       <w:r>
+        <w:t>`GET /api/content/v3/bootstrap`</w:t>
+      </w:r>
+    </w:p>
+    <w:p>
+      <w:pPr>
+        <w:pStyle w:val="ListBullet"/>
+      </w:pPr>
+      <w:r>
+        <w:t>`GET /api/content/v3/landing`</w:t>
+      </w:r>
+    </w:p>
+    <w:p>
+      <w:pPr>
+        <w:pStyle w:val="ListBullet"/>
+      </w:pPr>
+      <w:r>
+        <w:t>`GET /api/content/v3/work`</w:t>
+      </w:r>
+    </w:p>
+    <w:p>
+      <w:pPr>
+        <w:pStyle w:val="ListBullet"/>
+      </w:pPr>
+      <w:r>
+        <w:t>`GET /api/content/v3/projects/categories`</w:t>
+      </w:r>
+    </w:p>
+    <w:p>
+      <w:pPr>
+        <w:pStyle w:val="ListBullet"/>
+      </w:pPr>
+      <w:r>
+        <w:t>`POST /api/content/v3/projects/items`</w:t>
+      </w:r>
+    </w:p>
+    <w:p>
+      <w:pPr>
+        <w:pStyle w:val="ListBullet"/>
+      </w:pPr>
+      <w:r>
+        <w:t>`GET /api/content/v3/blog/:listItemId`</w:t>
+      </w:r>
+    </w:p>
+    <w:p>
+      <w:pPr>
+        <w:pStyle w:val="ListBullet"/>
+      </w:pPr>
+      <w:r>
+        <w:t>`GET /api/content/v3/admin/dashboard`</w:t>
+      </w:r>
+    </w:p>
+    <w:p>
+      <w:pPr>
+        <w:pStyle w:val="ListBullet"/>
+      </w:pPr>
+      <w:r>
+        <w:t>`GET /api/content/v3/admin/content`</w:t>
+      </w:r>
+    </w:p>
+    <w:p>
+      <w:pPr>
+        <w:pStyle w:val="ListBullet"/>
+      </w:pPr>
+      <w:r>
         <w:t>`POST /api/content`</w:t>
       </w:r>
     </w:p>
@@ -4198,6 +4385,14 @@
         <w:t>`DELETE /api/notifications/schedule/:scheduleName`</w:t>
       </w:r>
     </w:p>
+    <w:p>
+      <w:pPr>
+        <w:pStyle w:val="ListBullet"/>
+      </w:pPr>
+      <w:r>
+        <w:t>`POST /api/notifications/unpublish`</w:t>
+      </w:r>
+    </w:p>
     <w:p/>
     <w:p>
       <w:pPr>
@@ -4421,6 +4616,22 @@
         <w:pStyle w:val="ListBullet"/>
       </w:pPr>
       <w:r>
+        <w:t>ignores stale/non-active scheduled publish executions using schedule-name checks.</w:t>
+      </w:r>
+    </w:p>
+    <w:p>
+      <w:pPr>
+        <w:pStyle w:val="ListBullet"/>
+      </w:pPr>
+      <w:r>
+        <w:t>supports unpublish cleanup of active + stale schedules.</w:t>
+      </w:r>
+    </w:p>
+    <w:p>
+      <w:pPr>
+        <w:pStyle w:val="ListBullet"/>
+      </w:pPr>
+      <w:r>
         <w:t>supports subscriber admin list/add/remove through notifications route surface.</w:t>
       </w:r>
     </w:p>
@@ -5495,6 +5706,33 @@
         <w:t>| Authoring hotkeys | `/Users/grayson/Desktop/Portfolio/blog-authoring-gui/src/app/services/hotkeys.service.ts` |</w:t>
       </w:r>
     </w:p>
+    <w:p>
+      <w:r>
+        <w:rPr>
+          <w:rFonts w:ascii="Consolas" w:hAnsi="Consolas"/>
+          <w:sz w:val="18"/>
+        </w:rPr>
+        <w:t>| Content Studio workspace | `/Users/grayson/Desktop/Portfolio/blog-authoring-gui/src/app/pages/content-studio/content-studio.component.ts` |</w:t>
+      </w:r>
+    </w:p>
+    <w:p>
+      <w:r>
+        <w:rPr>
+          <w:rFonts w:ascii="Consolas" w:hAnsi="Consolas"/>
+          <w:sz w:val="18"/>
+        </w:rPr>
+        <w:t>| Public read client | `/Users/grayson/Desktop/Portfolio/portfolio-app/src/app/services/redis.service.ts` |</w:t>
+      </w:r>
+    </w:p>
+    <w:p>
+      <w:r>
+        <w:rPr>
+          <w:rFonts w:ascii="Consolas" w:hAnsi="Consolas"/>
+          <w:sz w:val="18"/>
+        </w:rPr>
+        <w:t>| Public analytics client | `/Users/grayson/Desktop/Portfolio/portfolio-app/src/app/services/analytics.service.ts` |</w:t>
+      </w:r>
+    </w:p>
     <w:p/>
     <w:p>
       <w:pPr>
@@ -5547,16 +5785,161 @@
           <w:rFonts w:ascii="Consolas" w:hAnsi="Consolas"/>
           <w:sz w:val="18"/>
         </w:rPr>
-        <w:t>| client route-scoped cache | `redis.service.ts`, `blog-api.service.ts` | enabled |</w:t>
-      </w:r>
-    </w:p>
-    <w:p>
-      <w:r>
-        <w:rPr>
-          <w:rFonts w:ascii="Consolas" w:hAnsi="Consolas"/>
-          <w:sz w:val="18"/>
-        </w:rPr>
-        <w:t>| server in-memory GET cache | `redis-api-server/src/app.js` | enabled |</w:t>
+        <w:t>| client route-scoped in-memory reuse | `redis.service.ts`, `blog-api.service.ts` | enabled |</w:t>
+      </w:r>
+    </w:p>
+    <w:p>
+      <w:r>
+        <w:rPr>
+          <w:rFonts w:ascii="Consolas" w:hAnsi="Consolas"/>
+          <w:sz w:val="18"/>
+        </w:rPr>
+        <w:t>| browser snapshot cache | frontend apps | disabled |</w:t>
+      </w:r>
+    </w:p>
+    <w:p>
+      <w:r>
+        <w:rPr>
+          <w:rFonts w:ascii="Consolas" w:hAnsi="Consolas"/>
+          <w:sz w:val="18"/>
+        </w:rPr>
+        <w:t>| server in-memory GET cache | `redis-api-server/src/app.js` | removed |</w:t>
+      </w:r>
+    </w:p>
+    <w:p>
+      <w:r>
+        <w:rPr>
+          <w:rFonts w:ascii="Consolas" w:hAnsi="Consolas"/>
+          <w:sz w:val="18"/>
+        </w:rPr>
+        <w:t>| dynamic GET cache headers | `redis-api-server/src/app.js` | `no-store` |</w:t>
+      </w:r>
+    </w:p>
+    <w:p/>
+    <w:p>
+      <w:pPr>
+        <w:pStyle w:val="Heading2"/>
+      </w:pPr>
+      <w:r>
+        <w:t>8. Key Route Contracts</w:t>
+      </w:r>
+    </w:p>
+    <w:p/>
+    <w:p>
+      <w:r>
+        <w:rPr>
+          <w:rFonts w:ascii="Consolas" w:hAnsi="Consolas"/>
+          <w:sz w:val="18"/>
+        </w:rPr>
+        <w:t>| Area | Contract |</w:t>
+      </w:r>
+    </w:p>
+    <w:p>
+      <w:r>
+        <w:rPr>
+          <w:rFonts w:ascii="Consolas" w:hAnsi="Consolas"/>
+          <w:sz w:val="18"/>
+        </w:rPr>
+        <w:t>|---|---|</w:t>
+      </w:r>
+    </w:p>
+    <w:p>
+      <w:r>
+        <w:rPr>
+          <w:rFonts w:ascii="Consolas" w:hAnsi="Consolas"/>
+          <w:sz w:val="18"/>
+        </w:rPr>
+        <w:t>| Public shell/bootstrap | `GET /api/content/v3/bootstrap` |</w:t>
+      </w:r>
+    </w:p>
+    <w:p>
+      <w:r>
+        <w:rPr>
+          <w:rFonts w:ascii="Consolas" w:hAnsi="Consolas"/>
+          <w:sz w:val="18"/>
+        </w:rPr>
+        <w:t>| Landing | `GET /api/content/v3/landing` |</w:t>
+      </w:r>
+    </w:p>
+    <w:p>
+      <w:r>
+        <w:rPr>
+          <w:rFonts w:ascii="Consolas" w:hAnsi="Consolas"/>
+          <w:sz w:val="18"/>
+        </w:rPr>
+        <w:t>| Work | `GET /api/content/v3/work` |</w:t>
+      </w:r>
+    </w:p>
+    <w:p>
+      <w:r>
+        <w:rPr>
+          <w:rFonts w:ascii="Consolas" w:hAnsi="Consolas"/>
+          <w:sz w:val="18"/>
+        </w:rPr>
+        <w:t>| Projects categories | `GET /api/content/v3/projects/categories` |</w:t>
+      </w:r>
+    </w:p>
+    <w:p>
+      <w:r>
+        <w:rPr>
+          <w:rFonts w:ascii="Consolas" w:hAnsi="Consolas"/>
+          <w:sz w:val="18"/>
+        </w:rPr>
+        <w:t>| Projects item hydration | `POST /api/content/v3/projects/items` |</w:t>
+      </w:r>
+    </w:p>
+    <w:p>
+      <w:r>
+        <w:rPr>
+          <w:rFonts w:ascii="Consolas" w:hAnsi="Consolas"/>
+          <w:sz w:val="18"/>
+        </w:rPr>
+        <w:t>| Blog feed cards | `GET /api/content/v2/blog/cards` |</w:t>
+      </w:r>
+    </w:p>
+    <w:p>
+      <w:r>
+        <w:rPr>
+          <w:rFonts w:ascii="Consolas" w:hAnsi="Consolas"/>
+          <w:sz w:val="18"/>
+        </w:rPr>
+        <w:t>| Blog feed media hydration | `GET /api/content/v2/blog/cards/media` |</w:t>
+      </w:r>
+    </w:p>
+    <w:p>
+      <w:r>
+        <w:rPr>
+          <w:rFonts w:ascii="Consolas" w:hAnsi="Consolas"/>
+          <w:sz w:val="18"/>
+        </w:rPr>
+        <w:t>| Blog detail | `GET /api/content/v3/blog/:listItemId` |</w:t>
+      </w:r>
+    </w:p>
+    <w:p>
+      <w:r>
+        <w:rPr>
+          <w:rFonts w:ascii="Consolas" w:hAnsi="Consolas"/>
+          <w:sz w:val="18"/>
+        </w:rPr>
+        <w:t>| Authoring dashboard | `GET /api/content/v3/admin/dashboard` |</w:t>
+      </w:r>
+    </w:p>
+    <w:p>
+      <w:r>
+        <w:rPr>
+          <w:rFonts w:ascii="Consolas" w:hAnsi="Consolas"/>
+          <w:sz w:val="18"/>
+        </w:rPr>
+        <w:t>| Authoring Content Studio | `GET /api/content/v3/admin/content` |</w:t>
+      </w:r>
+    </w:p>
+    <w:p>
+      <w:r>
+        <w:rPr>
+          <w:rFonts w:ascii="Consolas" w:hAnsi="Consolas"/>
+          <w:sz w:val="18"/>
+        </w:rPr>
+        <w:t>| Unpublish action | `POST /api/notifications/unpublish` |</w:t>
       </w:r>
     </w:p>
     <w:p>

</xml_diff>